<commit_message>
Sửa lỗi rà soát nhóm 2: đèn tín hiệu phía trước + GLOSA an toàn, OBD đúng PID + đối chiếu GPS, SOS xác nhận dừng xe + không gửi 0,0, QR tự lấy vị trí, tuần tra giữ trụ/toạ độ trụ, CSV chặn công thức, OCR chỉ tham khảo
Co-Authored-By: Claude Opus 5.5 <noreply@anthropic.com>
Claude-Session: https://claude.ai/code/session_014bYGfLE9esUGsdvgTU55Kr
</commit_message>
<xml_diff>
--- a/docs/Huong-dan-su-dung-Lai-An-Toan.docx
+++ b/docs/Huong-dan-su-dung-Lai-An-Toan.docx
@@ -125,7 +125,7 @@
         </w:rPr>
         <w:t xml:space="preserve">Địa chỉ: </w:t>
       </w:r>
-      <w:hyperlink w:history="1" r:id="rIdpa9czslq_4cclabru2v6w">
+      <w:hyperlink w:history="1" r:id="rIdcgaxykvutmgzexantuhd7">
         <w:r>
           <w:rPr>
             <w:rFonts w:ascii="Arial" w:cs="Arial" w:eastAsia="Arial" w:hAnsi="Arial"/>
@@ -4203,21 +4203,35 @@
         <w:rPr>
           <w:rFonts w:ascii="Arial" w:cs="Arial" w:eastAsia="Arial" w:hAnsi="Arial"/>
         </w:rPr>
-        <w:t xml:space="preserve">, app dùng hình ảnh camera hành trình để nhận dạng biển tròn viền đỏ (20–120 km/h). Biển chỉ được công nhận khi thấy cùng một số ở nhiều khung hình liên tiếp và chỉ thay thế mức </w:t>
-      </w:r>
-      <w:r>
-        <w:rPr>
-          <w:rFonts w:ascii="Arial" w:cs="Arial" w:eastAsia="Arial" w:hAnsi="Arial"/>
-          <w:b/>
-          <w:bCs/>
-        </w:rPr>
-        <w:t xml:space="preserve">ước tính</w:t>
-      </w:r>
-      <w:r>
-        <w:rPr>
-          <w:rFonts w:ascii="Arial" w:cs="Arial" w:eastAsia="Arial" w:hAnsi="Arial"/>
-        </w:rPr>
-        <w:t xml:space="preserve">, không ghi đè dữ liệu biển thật. Kết quả hiện ở thẻ “Biển nhận dạng: …”.</w:t>
+        <w:t xml:space="preserve">, app dùng hình ảnh camera hành trình để nhận dạng biển tròn viền đỏ (20–120 km/h). Biển chỉ được công nhận khi thấy cùng một số ở ít nhất 3 trong 5 khung hình gần nhất. Kết quả chỉ hiện ở thẻ </w:t>
+      </w:r>
+      <w:r>
+        <w:rPr>
+          <w:rFonts w:ascii="Arial" w:cs="Arial" w:eastAsia="Arial" w:hAnsi="Arial"/>
+          <w:b/>
+          <w:bCs/>
+        </w:rPr>
+        <w:t xml:space="preserve">“Biển nhận dạng: … (tham khảo)”</w:t>
+      </w:r>
+      <w:r>
+        <w:rPr>
+          <w:rFonts w:ascii="Arial" w:cs="Arial" w:eastAsia="Arial" w:hAnsi="Arial"/>
+        </w:rPr>
+        <w:t xml:space="preserve"> trong 5 phút, </w:t>
+      </w:r>
+      <w:r>
+        <w:rPr>
+          <w:rFonts w:ascii="Arial" w:cs="Arial" w:eastAsia="Arial" w:hAnsi="Arial"/>
+          <w:b/>
+          <w:bCs/>
+        </w:rPr>
+        <w:t xml:space="preserve">không</w:t>
+      </w:r>
+      <w:r>
+        <w:rPr>
+          <w:rFonts w:ascii="Arial" w:cs="Arial" w:eastAsia="Arial" w:hAnsi="Arial"/>
+        </w:rPr>
+        <w:t xml:space="preserve"> thay đổi giới hạn tốc độ của app (camera có thể đọc nhầm số dán sau đuôi xe tải).</w:t>
       </w:r>
     </w:p>
     <w:p>
@@ -5137,21 +5151,21 @@
         <w:rPr>
           <w:rFonts w:ascii="Arial" w:cs="Arial" w:eastAsia="Arial" w:hAnsi="Arial"/>
         </w:rPr>
-        <w:t xml:space="preserve"> (hiện khi đang lái) để gửi cho người thân đường link xem vị trí xe trên bản đồ, kèm điểm đến và giờ đến dự kiến nếu đang dẫn đường (qua Zalo, tin nhắn…). Bấm lại nút để </w:t>
-      </w:r>
-      <w:r>
-        <w:rPr>
-          <w:rFonts w:ascii="Arial" w:cs="Arial" w:eastAsia="Arial" w:hAnsi="Arial"/>
-          <w:b/>
-          <w:bCs/>
-        </w:rPr>
-        <w:t xml:space="preserve">tắt chia sẻ</w:t>
-      </w:r>
-      <w:r>
-        <w:rPr>
-          <w:rFonts w:ascii="Arial" w:cs="Arial" w:eastAsia="Arial" w:hAnsi="Arial"/>
-        </w:rPr>
-        <w:t xml:space="preserve">; dừng chuyến đi cũng tự tắt.</w:t>
+        <w:t xml:space="preserve"> trên thẻ dẫn đường để gửi cho người thân đường link xem vị trí xe trên bản đồ, kèm điểm đến và giờ đến dự kiến (qua Zalo, tin nhắn…). Khi đang chia sẻ, màn hình có thẻ xanh </w:t>
+      </w:r>
+      <w:r>
+        <w:rPr>
+          <w:rFonts w:ascii="Arial" w:cs="Arial" w:eastAsia="Arial" w:hAnsi="Arial"/>
+          <w:b/>
+          <w:bCs/>
+        </w:rPr>
+        <w:t xml:space="preserve">“Đang chia sẻ hành trình · bấm để tắt”</w:t>
+      </w:r>
+      <w:r>
+        <w:rPr>
+          <w:rFonts w:ascii="Arial" w:cs="Arial" w:eastAsia="Arial" w:hAnsi="Arial"/>
+        </w:rPr>
+        <w:t xml:space="preserve">; bấm vào thẻ để tắt. Dừng chuyến đi cũng tự tắt. Nếu app bị tắt giữa chuyến, mở lại sẽ tiếp tục chia sẻ với cùng đường link.</w:t>
       </w:r>
     </w:p>
     <w:p>
@@ -6666,7 +6680,7 @@
         <w:rPr>
           <w:rFonts w:ascii="Arial" w:cs="Arial" w:eastAsia="Arial" w:hAnsi="Arial"/>
         </w:rPr>
-        <w:t xml:space="preserve"> cho từng trụ. Trụ đã đánh giá sẽ chuyển sang trụ kế tiếp.</w:t>
+        <w:t xml:space="preserve"> cho từng trụ. Trụ vừa đi qua được giữ trên màn hình thêm vài giây để bấm đúng trụ; báo cáo dùng toạ độ trụ trong danh sách. Trụ đã đánh giá sẽ chuyển sang trụ kế tiếp.</w:t>
       </w:r>
     </w:p>
     <w:p>
@@ -6745,7 +6759,7 @@
         <w:rPr>
           <w:rFonts w:ascii="Arial" w:cs="Arial" w:eastAsia="Arial" w:hAnsi="Arial"/>
         </w:rPr>
-        <w:t xml:space="preserve"> tạo trang in mã QR từ danh sách trụ đã nạp, để dán lên trụ.</w:t>
+        <w:t xml:space="preserve"> tạo trang in mã QR từ danh sách trụ đã nạp (mỗi file tối đa 200 mã; danh sách lớn được tải về thành nhiều file), để dán lên trụ.</w:t>
       </w:r>
     </w:p>
     <w:p>
@@ -6803,7 +6817,7 @@
         <w:rPr>
           <w:rFonts w:ascii="Arial" w:cs="Arial" w:eastAsia="Arial" w:hAnsi="Arial"/>
         </w:rPr>
-        <w:t xml:space="preserve"> để gửi báo cáo.</w:t>
+        <w:t xml:space="preserve">. App lấy vị trí của trụ trong danh sách (hoặc xin vị trí điện thoại một lần) và gửi báo cáo ngay.</w:t>
       </w:r>
     </w:p>
     <w:p>
@@ -7265,7 +7279,21 @@
         <w:rPr>
           <w:rFonts w:ascii="Arial" w:cs="Arial" w:eastAsia="Arial" w:hAnsi="Arial"/>
         </w:rPr>
-        <w:t xml:space="preserve">Khi phát hiện va chạm mạnh, app hiện màn hình đỏ </w:t>
+        <w:t xml:space="preserve">Khi phát hiện va chạm mạnh </w:t>
+      </w:r>
+      <w:r>
+        <w:rPr>
+          <w:rFonts w:ascii="Arial" w:cs="Arial" w:eastAsia="Arial" w:hAnsi="Arial"/>
+          <w:b/>
+          <w:bCs/>
+        </w:rPr>
+        <w:t xml:space="preserve">và xe dừng hẳn ngay sau đó</w:t>
+      </w:r>
+      <w:r>
+        <w:rPr>
+          <w:rFonts w:ascii="Arial" w:cs="Arial" w:eastAsia="Arial" w:hAnsi="Arial"/>
+        </w:rPr>
+        <w:t xml:space="preserve"> (nếu xe vẫn chạy bình thường, ví dụ qua ổ gà, app bỏ qua), app hiện màn hình đỏ </w:t>
       </w:r>
       <w:r>
         <w:rPr>
@@ -7337,7 +7365,7 @@
         <w:rPr>
           <w:rFonts w:ascii="Arial" w:cs="Arial" w:eastAsia="Arial" w:hAnsi="Arial"/>
         </w:rPr>
-        <w:t xml:space="preserve"> chứa vị trí để gửi cho người thân; có thể bấm </w:t>
+        <w:t xml:space="preserve"> chứa vị trí để gửi cho người thân (nếu chưa có GPS, tin nhắn ghi rõ “chưa xác định được vị trí”); có thể bấm </w:t>
       </w:r>
       <w:r>
         <w:rPr>
@@ -7572,7 +7600,35 @@
         <w:rPr>
           <w:rFonts w:ascii="Arial" w:cs="Arial" w:eastAsia="Arial" w:hAnsi="Arial"/>
         </w:rPr>
-        <w:t xml:space="preserve">Với loại xe tải/xe khách lớn, app hiện thẻ đỏ </w:t>
+        <w:t xml:space="preserve">Với loại xe </w:t>
+      </w:r>
+      <w:r>
+        <w:rPr>
+          <w:rFonts w:ascii="Arial" w:cs="Arial" w:eastAsia="Arial" w:hAnsi="Arial"/>
+          <w:b/>
+          <w:bCs/>
+        </w:rPr>
+        <w:t xml:space="preserve">tải/xe khách lớn</w:t>
+      </w:r>
+      <w:r>
+        <w:rPr>
+          <w:rFonts w:ascii="Arial" w:cs="Arial" w:eastAsia="Arial" w:hAnsi="Arial"/>
+        </w:rPr>
+        <w:t xml:space="preserve"> và </w:t>
+      </w:r>
+      <w:r>
+        <w:rPr>
+          <w:rFonts w:ascii="Arial" w:cs="Arial" w:eastAsia="Arial" w:hAnsi="Arial"/>
+          <w:b/>
+          <w:bCs/>
+        </w:rPr>
+        <w:t xml:space="preserve">xe buýt, đầu kéo</w:t>
+      </w:r>
+      <w:r>
+        <w:rPr>
+          <w:rFonts w:ascii="Arial" w:cs="Arial" w:eastAsia="Arial" w:hAnsi="Arial"/>
+        </w:rPr>
+        <w:t xml:space="preserve">, app hiện thẻ đỏ </w:t>
       </w:r>
       <w:r>
         <w:rPr>
@@ -7622,7 +7678,35 @@
         <w:rPr>
           <w:rFonts w:ascii="Arial" w:cs="Arial" w:eastAsia="Arial" w:hAnsi="Arial"/>
         </w:rPr>
-        <w:t xml:space="preserve"> và gợi ý dải tốc độ để qua kịp đèn xanh mà không phải phanh gấp. Dữ liệu chu kỳ đèn do đơn vị quản lý cung cấp; nơi chưa có dữ liệu thì không hiện.</w:t>
+        <w:t xml:space="preserve">. Khi đèn đỏ, app gợi ý chạy chậm lại để tới nơi vừa lúc đèn xanh. Khi đèn xanh, app chỉ gợi ý nếu </w:t>
+      </w:r>
+      <w:r>
+        <w:rPr>
+          <w:rFonts w:ascii="Arial" w:cs="Arial" w:eastAsia="Arial" w:hAnsi="Arial"/>
+          <w:b/>
+          <w:bCs/>
+        </w:rPr>
+        <w:t xml:space="preserve">không cần tăng tốc</w:t>
+      </w:r>
+      <w:r>
+        <w:rPr>
+          <w:rFonts w:ascii="Arial" w:cs="Arial" w:eastAsia="Arial" w:hAnsi="Arial"/>
+        </w:rPr>
+        <w:t xml:space="preserve"> và luôn chừa biên an toàn 3 giây; giọng nói chỉ đọc màu đèn và số giây. Chỉ báo các nút giao </w:t>
+      </w:r>
+      <w:r>
+        <w:rPr>
+          <w:rFonts w:ascii="Arial" w:cs="Arial" w:eastAsia="Arial" w:hAnsi="Arial"/>
+          <w:b/>
+          <w:bCs/>
+        </w:rPr>
+        <w:t xml:space="preserve">phía trước</w:t>
+      </w:r>
+      <w:r>
+        <w:rPr>
+          <w:rFonts w:ascii="Arial" w:cs="Arial" w:eastAsia="Arial" w:hAnsi="Arial"/>
+        </w:rPr>
+        <w:t xml:space="preserve">, không báo nút đã đi qua. Dữ liệu chu kỳ đèn do đơn vị quản lý cung cấp; nơi chưa có dữ liệu thì không hiện.</w:t>
       </w:r>
     </w:p>
     <w:p>
@@ -8036,7 +8120,7 @@
         <w:rPr>
           <w:rFonts w:ascii="Arial" w:cs="Arial" w:eastAsia="Arial" w:hAnsi="Arial"/>
         </w:rPr>
-        <w:t xml:space="preserve"> (chính xác hơn GPS khi qua hầm), hiện vòng tua máy và nhiệt độ nước làm mát. Chỉ hỗ trợ Chrome trên Android.</w:t>
+        <w:t xml:space="preserve"> thay cho GPS, hiện vòng tua máy và nhiệt độ nước làm mát. Nếu tốc độ OBD lệch nhiều so với GPS (quá 20 km/h trong 5 giây), app báo và tự quay về dùng GPS. Chỉ hỗ trợ Chrome trên Android.</w:t>
       </w:r>
     </w:p>
     <w:p>

</xml_diff>

<commit_message>
Biển tốc độ không nhảy 50↔60 giữa đường chính và đường song hành (giữ con đường đang đi); cho kéo/thu phóng bản đồ trên màn hình lái, tự quay về theo xe sau 15 s
Co-Authored-By: Claude Opus 5.5 <noreply@anthropic.com>
Claude-Session: https://claude.ai/code/session_014bYGfLE9esUGsdvgTU55Kr
</commit_message>
<xml_diff>
--- a/docs/Huong-dan-su-dung-Lai-An-Toan.docx
+++ b/docs/Huong-dan-su-dung-Lai-An-Toan.docx
@@ -125,7 +125,7 @@
         </w:rPr>
         <w:t xml:space="preserve">Địa chỉ: </w:t>
       </w:r>
-      <w:hyperlink w:history="1" r:id="rIdcgaxykvutmgzexantuhd7">
+      <w:hyperlink w:history="1" r:id="rIdxeqk_v8yq4rjfhh8oqgds">
         <w:r>
           <w:rPr>
             <w:rFonts w:ascii="Arial" w:cs="Arial" w:eastAsia="Arial" w:hAnsi="Arial"/>
@@ -3146,6 +3146,129 @@
         </w:tc>
       </w:tr>
     </w:tbl>
+    <w:p>
+      <w:pPr>
+        <w:pStyle w:val="Heading2"/>
+      </w:pPr>
+      <w:r>
+        <w:rPr>
+          <w:rFonts w:ascii="Arial" w:cs="Arial" w:eastAsia="Arial" w:hAnsi="Arial"/>
+        </w:rPr>
+        <w:t xml:space="preserve">3.3. Điều khiển bản đồ</w:t>
+      </w:r>
+    </w:p>
+    <w:p>
+      <w:pPr>
+        <w:pStyle w:val="ListParagraph"/>
+        <w:numPr>
+          <w:ilvl w:val="0"/>
+          <w:numId w:val="2"/>
+        </w:numPr>
+        <w:spacing w:after="60" w:line="290"/>
+      </w:pPr>
+      <w:r>
+        <w:rPr>
+          <w:rFonts w:ascii="Arial" w:cs="Arial" w:eastAsia="Arial" w:hAnsi="Arial"/>
+          <w:b/>
+          <w:bCs/>
+        </w:rPr>
+        <w:t xml:space="preserve">Kéo</w:t>
+      </w:r>
+      <w:r>
+        <w:rPr>
+          <w:rFonts w:ascii="Arial" w:cs="Arial" w:eastAsia="Arial" w:hAnsi="Arial"/>
+        </w:rPr>
+        <w:t xml:space="preserve"> bản đồ bằng một ngón để xem chỗ khác; </w:t>
+      </w:r>
+      <w:r>
+        <w:rPr>
+          <w:rFonts w:ascii="Arial" w:cs="Arial" w:eastAsia="Arial" w:hAnsi="Arial"/>
+          <w:b/>
+          <w:bCs/>
+        </w:rPr>
+        <w:t xml:space="preserve">chụm/mở hai ngón</w:t>
+      </w:r>
+      <w:r>
+        <w:rPr>
+          <w:rFonts w:ascii="Arial" w:cs="Arial" w:eastAsia="Arial" w:hAnsi="Arial"/>
+        </w:rPr>
+        <w:t xml:space="preserve"> hoặc </w:t>
+      </w:r>
+      <w:r>
+        <w:rPr>
+          <w:rFonts w:ascii="Arial" w:cs="Arial" w:eastAsia="Arial" w:hAnsi="Arial"/>
+          <w:b/>
+          <w:bCs/>
+        </w:rPr>
+        <w:t xml:space="preserve">chạm hai lần</w:t>
+      </w:r>
+      <w:r>
+        <w:rPr>
+          <w:rFonts w:ascii="Arial" w:cs="Arial" w:eastAsia="Arial" w:hAnsi="Arial"/>
+        </w:rPr>
+        <w:t xml:space="preserve"> để thu nhỏ/phóng to.</w:t>
+      </w:r>
+    </w:p>
+    <w:p>
+      <w:pPr>
+        <w:pStyle w:val="ListParagraph"/>
+        <w:numPr>
+          <w:ilvl w:val="0"/>
+          <w:numId w:val="2"/>
+        </w:numPr>
+        <w:spacing w:after="60" w:line="290"/>
+      </w:pPr>
+      <w:r>
+        <w:rPr>
+          <w:rFonts w:ascii="Arial" w:cs="Arial" w:eastAsia="Arial" w:hAnsi="Arial"/>
+        </w:rPr>
+        <w:t xml:space="preserve">Khi đã kéo bản đồ, nút vàng </w:t>
+      </w:r>
+      <w:r>
+        <w:rPr>
+          <w:rFonts w:ascii="Arial" w:cs="Arial" w:eastAsia="Arial" w:hAnsi="Arial"/>
+          <w:b/>
+          <w:bCs/>
+        </w:rPr>
+        <w:t xml:space="preserve">Theo xe</w:t>
+      </w:r>
+      <w:r>
+        <w:rPr>
+          <w:rFonts w:ascii="Arial" w:cs="Arial" w:eastAsia="Arial" w:hAnsi="Arial"/>
+        </w:rPr>
+        <w:t xml:space="preserve"> hiện ở dưới: bấm để quay về vị trí xe. Nếu đang chạy, sau </w:t>
+      </w:r>
+      <w:r>
+        <w:rPr>
+          <w:rFonts w:ascii="Arial" w:cs="Arial" w:eastAsia="Arial" w:hAnsi="Arial"/>
+          <w:b/>
+          <w:bCs/>
+        </w:rPr>
+        <w:t xml:space="preserve">15 giây</w:t>
+      </w:r>
+      <w:r>
+        <w:rPr>
+          <w:rFonts w:ascii="Arial" w:cs="Arial" w:eastAsia="Arial" w:hAnsi="Arial"/>
+        </w:rPr>
+        <w:t xml:space="preserve"> không chạm app tự quay về theo xe.</w:t>
+      </w:r>
+    </w:p>
+    <w:p>
+      <w:pPr>
+        <w:pStyle w:val="ListParagraph"/>
+        <w:numPr>
+          <w:ilvl w:val="0"/>
+          <w:numId w:val="2"/>
+        </w:numPr>
+        <w:spacing w:after="60" w:line="290"/>
+      </w:pPr>
+      <w:r>
+        <w:rPr>
+          <w:rFonts w:ascii="Arial" w:cs="Arial" w:eastAsia="Arial" w:hAnsi="Arial"/>
+        </w:rPr>
+        <w:t xml:space="preserve">Bản đồ tự xoay theo hướng xe chạy, nên thao tác xoay bằng tay được tắt.</w:t>
+      </w:r>
+    </w:p>
     <w:p>
       <w:pPr>
         <w:pStyle w:val="Heading1"/>

</xml_diff>

<commit_message>
Trang Hướng dẫn sử dụng (huong-dan/) có mục lục, tải bản Word; link trên màn hình đầu và trong Cài đặt; cập nhật hướng dẫn: lộ trình thay thế, toạ độ, điểm lưu, góp ý, xoá dấu camera, số tốc độ
Co-Authored-By: Claude Opus 5.5 <noreply@anthropic.com>
Claude-Session: https://claude.ai/code/session_014bYGfLE9esUGsdvgTU55Kr
</commit_message>
<xml_diff>
--- a/docs/Huong-dan-su-dung-Lai-An-Toan.docx
+++ b/docs/Huong-dan-su-dung-Lai-An-Toan.docx
@@ -125,7 +125,7 @@
         </w:rPr>
         <w:t xml:space="preserve">Địa chỉ: </w:t>
       </w:r>
-      <w:hyperlink w:history="1" r:id="rIdxeqk_v8yq4rjfhh8oqgds">
+      <w:hyperlink w:history="1" r:id="rIdlbxv-jzxmur7qksviarqm">
         <w:r>
           <w:rPr>
             <w:rFonts w:ascii="Arial" w:cs="Arial" w:eastAsia="Arial" w:hAnsi="Arial"/>
@@ -3479,7 +3479,95 @@
                 <w:sz w:val="20"/>
                 <w:szCs w:val="20"/>
               </w:rPr>
-              <w:t xml:space="preserve">Biển thật đã được ghi nhận trên bản đồ OpenStreetMap</w:t>
+              <w:t xml:space="preserve">Biển thật đã ghi nhận trên bản đồ OpenStreetMap, hoặc theo công bố của cơ quan chức năng cho tuyến lớn</w:t>
+            </w:r>
+          </w:p>
+        </w:tc>
+        <w:tc>
+          <w:tcPr>
+            <w:tcW w:type="dxa" w:w="2200"/>
+            <w:tcBorders>
+              <w:top w:val="single" w:color="BFBFBF" w:sz="4"/>
+              <w:left w:val="single" w:color="BFBFBF" w:sz="4"/>
+              <w:bottom w:val="single" w:color="BFBFBF" w:sz="4"/>
+              <w:right w:val="single" w:color="BFBFBF" w:sz="4"/>
+            </w:tcBorders>
+            <w:tcMar>
+              <w:top w:type="dxa" w:w="60"/>
+              <w:left w:type="dxa" w:w="100"/>
+              <w:bottom w:type="dxa" w:w="60"/>
+              <w:right w:type="dxa" w:w="100"/>
+            </w:tcMar>
+          </w:tcPr>
+          <w:p>
+            <w:r>
+              <w:rPr>
+                <w:rFonts w:ascii="Arial" w:cs="Arial" w:eastAsia="Arial" w:hAnsi="Arial"/>
+                <w:b/>
+                <w:bCs/>
+                <w:sz w:val="20"/>
+                <w:szCs w:val="20"/>
+              </w:rPr>
+              <w:t xml:space="preserve">Có</w:t>
+            </w:r>
+          </w:p>
+        </w:tc>
+      </w:tr>
+      <w:tr>
+        <w:trPr>
+          <w:tblHeader w:val="off"/>
+        </w:trPr>
+        <w:tc>
+          <w:tcPr>
+            <w:tcW w:type="dxa" w:w="2800"/>
+            <w:tcBorders>
+              <w:top w:val="single" w:color="BFBFBF" w:sz="4"/>
+              <w:left w:val="single" w:color="BFBFBF" w:sz="4"/>
+              <w:bottom w:val="single" w:color="BFBFBF" w:sz="4"/>
+              <w:right w:val="single" w:color="BFBFBF" w:sz="4"/>
+            </w:tcBorders>
+            <w:tcMar>
+              <w:top w:type="dxa" w:w="60"/>
+              <w:left w:type="dxa" w:w="100"/>
+              <w:bottom w:type="dxa" w:w="60"/>
+              <w:right w:type="dxa" w:w="100"/>
+            </w:tcMar>
+          </w:tcPr>
+          <w:p>
+            <w:r>
+              <w:rPr>
+                <w:rFonts w:ascii="Arial" w:cs="Arial" w:eastAsia="Arial" w:hAnsi="Arial"/>
+                <w:sz w:val="20"/>
+                <w:szCs w:val="20"/>
+              </w:rPr>
+              <w:t xml:space="preserve">Viền đỏ liền, nhãn “Làn ô tô · hỗn hợp 50”</w:t>
+            </w:r>
+          </w:p>
+        </w:tc>
+        <w:tc>
+          <w:tcPr>
+            <w:tcW w:type="dxa" w:w="4638"/>
+            <w:tcBorders>
+              <w:top w:val="single" w:color="BFBFBF" w:sz="4"/>
+              <w:left w:val="single" w:color="BFBFBF" w:sz="4"/>
+              <w:bottom w:val="single" w:color="BFBFBF" w:sz="4"/>
+              <w:right w:val="single" w:color="BFBFBF" w:sz="4"/>
+            </w:tcBorders>
+            <w:tcMar>
+              <w:top w:type="dxa" w:w="60"/>
+              <w:left w:type="dxa" w:w="100"/>
+              <w:bottom w:type="dxa" w:w="60"/>
+              <w:right w:type="dxa" w:w="100"/>
+            </w:tcMar>
+          </w:tcPr>
+          <w:p>
+            <w:r>
+              <w:rPr>
+                <w:rFonts w:ascii="Arial" w:cs="Arial" w:eastAsia="Arial" w:hAnsi="Arial"/>
+                <w:sz w:val="20"/>
+                <w:szCs w:val="20"/>
+              </w:rPr>
+              <w:t xml:space="preserve">Tuyến tách làn (vd QL22 Hóc Môn: làn hỗn hợp 50, làn ô tô 60). Ô tô thấy số làn ô tô; xe máy thấy số làn hỗn hợp</w:t>
             </w:r>
           </w:p>
         </w:tc>
@@ -4301,7 +4389,135 @@
         <w:rPr>
           <w:rFonts w:ascii="Arial" w:cs="Arial" w:eastAsia="Arial" w:hAnsi="Arial"/>
         </w:rPr>
-        <w:t xml:space="preserve">4.2. Đọc biển báo bằng camera (thử nghiệm)</w:t>
+        <w:t xml:space="preserve">4.2. Số tốc độ khác đồng hồ xe?</w:t>
+      </w:r>
+    </w:p>
+    <w:p>
+      <w:pPr>
+        <w:spacing w:after="120" w:line="300"/>
+      </w:pPr>
+      <w:r>
+        <w:rPr>
+          <w:rFonts w:ascii="Arial" w:cs="Arial" w:eastAsia="Arial" w:hAnsi="Arial"/>
+        </w:rPr>
+        <w:t xml:space="preserve">Đồng hồ ô tô/xe máy luôn báo </w:t>
+      </w:r>
+      <w:r>
+        <w:rPr>
+          <w:rFonts w:ascii="Arial" w:cs="Arial" w:eastAsia="Arial" w:hAnsi="Arial"/>
+          <w:b/>
+          <w:bCs/>
+        </w:rPr>
+        <w:t xml:space="preserve">cao hơn</w:t>
+      </w:r>
+      <w:r>
+        <w:rPr>
+          <w:rFonts w:ascii="Arial" w:cs="Arial" w:eastAsia="Arial" w:hAnsi="Arial"/>
+        </w:rPr>
+        <w:t xml:space="preserve"> tốc độ thật vài % (ví dụ xe báo 53 thì thật ra khoảng 49). App đo bằng GPS nên hiện </w:t>
+      </w:r>
+      <w:r>
+        <w:rPr>
+          <w:rFonts w:ascii="Arial" w:cs="Arial" w:eastAsia="Arial" w:hAnsi="Arial"/>
+          <w:b/>
+          <w:bCs/>
+        </w:rPr>
+        <w:t xml:space="preserve">tốc độ thật</w:t>
+      </w:r>
+      <w:r>
+        <w:rPr>
+          <w:rFonts w:ascii="Arial" w:cs="Arial" w:eastAsia="Arial" w:hAnsi="Arial"/>
+        </w:rPr>
+        <w:t xml:space="preserve"> — đúng như camera đo. Muốn số trên app khớp đồng hồ xe: </w:t>
+      </w:r>
+      <w:r>
+        <w:rPr>
+          <w:rFonts w:ascii="Arial" w:cs="Arial" w:eastAsia="Arial" w:hAnsi="Arial"/>
+          <w:b/>
+          <w:bCs/>
+        </w:rPr>
+        <w:t xml:space="preserve">Cài đặt → Số tốc độ hiển thị → Như đồng hồ xe (+3/5/8/10%)</w:t>
+      </w:r>
+      <w:r>
+        <w:rPr>
+          <w:rFonts w:ascii="Arial" w:cs="Arial" w:eastAsia="Arial" w:hAnsi="Arial"/>
+        </w:rPr>
+        <w:t xml:space="preserve">. Cảnh báo vượt tốc độ vẫn tính theo tốc độ thật.</w:t>
+      </w:r>
+    </w:p>
+    <w:p>
+      <w:pPr>
+        <w:pStyle w:val="Heading2"/>
+      </w:pPr>
+      <w:r>
+        <w:rPr>
+          <w:rFonts w:ascii="Arial" w:cs="Arial" w:eastAsia="Arial" w:hAnsi="Arial"/>
+        </w:rPr>
+        <w:t xml:space="preserve">4.3. Báo sai giới hạn tốc độ</w:t>
+      </w:r>
+    </w:p>
+    <w:p>
+      <w:pPr>
+        <w:spacing w:after="120" w:line="300"/>
+      </w:pPr>
+      <w:r>
+        <w:rPr>
+          <w:rFonts w:ascii="Arial" w:cs="Arial" w:eastAsia="Arial" w:hAnsi="Arial"/>
+        </w:rPr>
+        <w:t xml:space="preserve">Thấy biển trên app khác biển thật: </w:t>
+      </w:r>
+      <w:r>
+        <w:rPr>
+          <w:rFonts w:ascii="Arial" w:cs="Arial" w:eastAsia="Arial" w:hAnsi="Arial"/>
+          <w:b/>
+          <w:bCs/>
+        </w:rPr>
+        <w:t xml:space="preserve">chạm vào biển tốc độ</w:t>
+      </w:r>
+      <w:r>
+        <w:rPr>
+          <w:rFonts w:ascii="Arial" w:cs="Arial" w:eastAsia="Arial" w:hAnsi="Arial"/>
+        </w:rPr>
+        <w:t xml:space="preserve"> trên màn hình → chọn </w:t>
+      </w:r>
+      <w:r>
+        <w:rPr>
+          <w:rFonts w:ascii="Arial" w:cs="Arial" w:eastAsia="Arial" w:hAnsi="Arial"/>
+          <w:b/>
+          <w:bCs/>
+        </w:rPr>
+        <w:t xml:space="preserve">số trên biển thật</w:t>
+      </w:r>
+      <w:r>
+        <w:rPr>
+          <w:rFonts w:ascii="Arial" w:cs="Arial" w:eastAsia="Arial" w:hAnsi="Arial"/>
+        </w:rPr>
+        <w:t xml:space="preserve"> → </w:t>
+      </w:r>
+      <w:r>
+        <w:rPr>
+          <w:rFonts w:ascii="Arial" w:cs="Arial" w:eastAsia="Arial" w:hAnsi="Arial"/>
+          <w:b/>
+          <w:bCs/>
+        </w:rPr>
+        <w:t xml:space="preserve">Gửi góp ý</w:t>
+      </w:r>
+      <w:r>
+        <w:rPr>
+          <w:rFonts w:ascii="Arial" w:cs="Arial" w:eastAsia="Arial" w:hAnsi="Arial"/>
+        </w:rPr>
+        <w:t xml:space="preserve">. Vị trí và đoạn đường được gửi kèm để người phát triển sửa dữ liệu.</w:t>
+      </w:r>
+    </w:p>
+    <w:p>
+      <w:pPr>
+        <w:pStyle w:val="Heading2"/>
+      </w:pPr>
+      <w:r>
+        <w:rPr>
+          <w:rFonts w:ascii="Arial" w:cs="Arial" w:eastAsia="Arial" w:hAnsi="Arial"/>
+        </w:rPr>
+        <w:t xml:space="preserve">4.4. Đọc biển báo bằng camera (thử nghiệm)</w:t>
       </w:r>
     </w:p>
     <w:p>
@@ -4643,7 +4859,21 @@
         <w:rPr>
           <w:rFonts w:ascii="Arial" w:cs="Arial" w:eastAsia="Arial" w:hAnsi="Arial"/>
         </w:rPr>
-        <w:t xml:space="preserve">: </w:t>
+        <w:t xml:space="preserve">: danh sách các dấu (giờ, khoảng cách) có nút </w:t>
+      </w:r>
+      <w:r>
+        <w:rPr>
+          <w:rFonts w:ascii="Arial" w:cs="Arial" w:eastAsia="Arial" w:hAnsi="Arial"/>
+          <w:b/>
+          <w:bCs/>
+        </w:rPr>
+        <w:t xml:space="preserve">Xoá</w:t>
+      </w:r>
+      <w:r>
+        <w:rPr>
+          <w:rFonts w:ascii="Arial" w:cs="Arial" w:eastAsia="Arial" w:hAnsi="Arial"/>
+        </w:rPr>
+        <w:t xml:space="preserve"> từng dấu, </w:t>
       </w:r>
       <w:r>
         <w:rPr>
@@ -4672,6 +4902,85 @@
           <w:rFonts w:ascii="Arial" w:cs="Arial" w:eastAsia="Arial" w:hAnsi="Arial"/>
         </w:rPr>
         <w:t xml:space="preserve">.</w:t>
+      </w:r>
+    </w:p>
+    <w:p>
+      <w:pPr>
+        <w:pStyle w:val="Heading2"/>
+      </w:pPr>
+      <w:r>
+        <w:rPr>
+          <w:rFonts w:ascii="Arial" w:cs="Arial" w:eastAsia="Arial" w:hAnsi="Arial"/>
+        </w:rPr>
+        <w:t xml:space="preserve">5.4. Xoá dấu camera bấm nhầm</w:t>
+      </w:r>
+    </w:p>
+    <w:p>
+      <w:pPr>
+        <w:pStyle w:val="ListParagraph"/>
+        <w:numPr>
+          <w:ilvl w:val="0"/>
+          <w:numId w:val="2"/>
+        </w:numPr>
+        <w:spacing w:after="60" w:line="290"/>
+      </w:pPr>
+      <w:r>
+        <w:rPr>
+          <w:rFonts w:ascii="Arial" w:cs="Arial" w:eastAsia="Arial" w:hAnsi="Arial"/>
+          <w:b/>
+          <w:bCs/>
+        </w:rPr>
+        <w:t xml:space="preserve">Chạm vào chấm cam</w:t>
+      </w:r>
+      <w:r>
+        <w:rPr>
+          <w:rFonts w:ascii="Arial" w:cs="Arial" w:eastAsia="Arial" w:hAnsi="Arial"/>
+        </w:rPr>
+        <w:t xml:space="preserve"> trên bản đồ → thông báo “Dấu camera anh đánh lúc…” → bấm </w:t>
+      </w:r>
+      <w:r>
+        <w:rPr>
+          <w:rFonts w:ascii="Arial" w:cs="Arial" w:eastAsia="Arial" w:hAnsi="Arial"/>
+          <w:b/>
+          <w:bCs/>
+        </w:rPr>
+        <w:t xml:space="preserve">Xoá dấu</w:t>
+      </w:r>
+      <w:r>
+        <w:rPr>
+          <w:rFonts w:ascii="Arial" w:cs="Arial" w:eastAsia="Arial" w:hAnsi="Arial"/>
+        </w:rPr>
+        <w:t xml:space="preserve">. Có </w:t>
+      </w:r>
+      <w:r>
+        <w:rPr>
+          <w:rFonts w:ascii="Arial" w:cs="Arial" w:eastAsia="Arial" w:hAnsi="Arial"/>
+          <w:b/>
+          <w:bCs/>
+        </w:rPr>
+        <w:t xml:space="preserve">Hoàn tác</w:t>
+      </w:r>
+      <w:r>
+        <w:rPr>
+          <w:rFonts w:ascii="Arial" w:cs="Arial" w:eastAsia="Arial" w:hAnsi="Arial"/>
+        </w:rPr>
+        <w:t xml:space="preserve"> trong vài giây.</w:t>
+      </w:r>
+    </w:p>
+    <w:p>
+      <w:pPr>
+        <w:pStyle w:val="ListParagraph"/>
+        <w:numPr>
+          <w:ilvl w:val="0"/>
+          <w:numId w:val="2"/>
+        </w:numPr>
+        <w:spacing w:after="60" w:line="290"/>
+      </w:pPr>
+      <w:r>
+        <w:rPr>
+          <w:rFonts w:ascii="Arial" w:cs="Arial" w:eastAsia="Arial" w:hAnsi="Arial"/>
+        </w:rPr>
+        <w:t xml:space="preserve">Dấu đã gửi lên máy chủ mà chưa được duyệt sẽ được rút lại luôn. Chấm camera của dữ liệu chung thì không xoá từ máy được.</w:t>
       </w:r>
     </w:p>
     <w:p>
@@ -4919,7 +5228,21 @@
         <w:rPr>
           <w:rFonts w:ascii="Arial" w:cs="Arial" w:eastAsia="Arial" w:hAnsi="Arial"/>
         </w:rPr>
-        <w:t xml:space="preserve">.</w:t>
+        <w:t xml:space="preserve">. Bấm nút </w:t>
+      </w:r>
+      <w:r>
+        <w:rPr>
+          <w:rFonts w:ascii="Arial" w:cs="Arial" w:eastAsia="Arial" w:hAnsi="Arial"/>
+          <w:b/>
+          <w:bCs/>
+        </w:rPr>
+        <w:t xml:space="preserve">Tìm</w:t>
+      </w:r>
+      <w:r>
+        <w:rPr>
+          <w:rFonts w:ascii="Arial" w:cs="Arial" w:eastAsia="Arial" w:hAnsi="Arial"/>
+        </w:rPr>
+        <w:t xml:space="preserve"> trên bàn phím để tìm ngay.</w:t>
       </w:r>
     </w:p>
     <w:p>
@@ -4949,7 +5272,110 @@
         <w:rPr>
           <w:rFonts w:ascii="Arial" w:cs="Arial" w:eastAsia="Arial" w:hAnsi="Arial"/>
         </w:rPr>
-        <w:t xml:space="preserve"> đã chọn và bắt đầu chỉ đường bằng giọng nói.</w:t>
+        <w:t xml:space="preserve"> đã chọn.</w:t>
+      </w:r>
+    </w:p>
+    <w:p>
+      <w:pPr>
+        <w:pStyle w:val="ListParagraph"/>
+        <w:numPr>
+          <w:ilvl w:val="0"/>
+          <w:numId w:val="6"/>
+        </w:numPr>
+        <w:spacing w:after="60" w:line="290"/>
+      </w:pPr>
+      <w:r>
+        <w:rPr>
+          <w:rFonts w:ascii="Arial" w:cs="Arial" w:eastAsia="Arial" w:hAnsi="Arial"/>
+        </w:rPr>
+        <w:t xml:space="preserve">Nếu có nhiều đường đi, app hiện </w:t>
+      </w:r>
+      <w:r>
+        <w:rPr>
+          <w:rFonts w:ascii="Arial" w:cs="Arial" w:eastAsia="Arial" w:hAnsi="Arial"/>
+          <w:b/>
+          <w:bCs/>
+        </w:rPr>
+        <w:t xml:space="preserve">Chọn lộ trình</w:t>
+      </w:r>
+      <w:r>
+        <w:rPr>
+          <w:rFonts w:ascii="Arial" w:cs="Arial" w:eastAsia="Arial" w:hAnsi="Arial"/>
+        </w:rPr>
+        <w:t xml:space="preserve">: tuyến xanh là tuyến đang chọn, tuyến xám là tuyến khác. Chạm tuyến xám trên bản đồ hoặc chọn trong danh sách (Nhanh nhất · km · phút, +x phút so với nhanh nhất) → bấm </w:t>
+      </w:r>
+      <w:r>
+        <w:rPr>
+          <w:rFonts w:ascii="Arial" w:cs="Arial" w:eastAsia="Arial" w:hAnsi="Arial"/>
+          <w:b/>
+          <w:bCs/>
+        </w:rPr>
+        <w:t xml:space="preserve">Đi tuyến này</w:t>
+      </w:r>
+      <w:r>
+        <w:rPr>
+          <w:rFonts w:ascii="Arial" w:cs="Arial" w:eastAsia="Arial" w:hAnsi="Arial"/>
+        </w:rPr>
+        <w:t xml:space="preserve">.</w:t>
+      </w:r>
+    </w:p>
+    <w:p>
+      <w:pPr>
+        <w:pStyle w:val="Heading2"/>
+      </w:pPr>
+      <w:r>
+        <w:rPr>
+          <w:rFonts w:ascii="Arial" w:cs="Arial" w:eastAsia="Arial" w:hAnsi="Arial"/>
+        </w:rPr>
+        <w:t xml:space="preserve">6.1b. Tìm bằng toạ độ hoặc link Google Maps</w:t>
+      </w:r>
+    </w:p>
+    <w:p>
+      <w:pPr>
+        <w:pStyle w:val="ListParagraph"/>
+        <w:numPr>
+          <w:ilvl w:val="0"/>
+          <w:numId w:val="2"/>
+        </w:numPr>
+        <w:spacing w:after="60" w:line="290"/>
+      </w:pPr>
+      <w:r>
+        <w:rPr>
+          <w:rFonts w:ascii="Arial" w:cs="Arial" w:eastAsia="Arial" w:hAnsi="Arial"/>
+        </w:rPr>
+        <w:t xml:space="preserve">Gõ/dán toạ độ vào ô tìm: `10.7725, 106.698`, `11,06176 106,529633`, `(11.06176, 106.529633)` hoặc dạng độ-phút-giây `11°03'42.3"N 106°31'46.7"E`.</w:t>
+      </w:r>
+    </w:p>
+    <w:p>
+      <w:pPr>
+        <w:pStyle w:val="ListParagraph"/>
+        <w:numPr>
+          <w:ilvl w:val="0"/>
+          <w:numId w:val="2"/>
+        </w:numPr>
+        <w:spacing w:after="60" w:line="290"/>
+      </w:pPr>
+      <w:r>
+        <w:rPr>
+          <w:rFonts w:ascii="Arial" w:cs="Arial" w:eastAsia="Arial" w:hAnsi="Arial"/>
+        </w:rPr>
+        <w:t xml:space="preserve">Dán link chia sẻ từ Google Maps (kể cả link rút gọn `maps.app.goo.gl/…`), link OpenStreetMap. Kết quả hiện “Toạ độ …, cách … km” → bấm để đi.</w:t>
+      </w:r>
+    </w:p>
+    <w:p>
+      <w:pPr>
+        <w:pStyle w:val="ListParagraph"/>
+        <w:numPr>
+          <w:ilvl w:val="0"/>
+          <w:numId w:val="2"/>
+        </w:numPr>
+        <w:spacing w:after="60" w:line="290"/>
+      </w:pPr>
+      <w:r>
+        <w:rPr>
+          <w:rFonts w:ascii="Arial" w:cs="Arial" w:eastAsia="Arial" w:hAnsi="Arial"/>
+        </w:rPr>
+        <w:t xml:space="preserve">Mở lại hộp tìm mà ô vẫn còn nội dung cũ thì app tự tìm lại.</w:t>
       </w:r>
     </w:p>
     <w:p>
@@ -5119,7 +5545,21 @@
         <w:rPr>
           <w:rFonts w:ascii="Arial" w:cs="Arial" w:eastAsia="Arial" w:hAnsi="Arial"/>
         </w:rPr>
-        <w:t xml:space="preserve">.</w:t>
+        <w:t xml:space="preserve">; hoặc bấm </w:t>
+      </w:r>
+      <w:r>
+        <w:rPr>
+          <w:rFonts w:ascii="Arial" w:cs="Arial" w:eastAsia="Arial" w:hAnsi="Arial"/>
+          <w:b/>
+          <w:bCs/>
+        </w:rPr>
+        <w:t xml:space="preserve">☆ Lưu</w:t>
+      </w:r>
+      <w:r>
+        <w:rPr>
+          <w:rFonts w:ascii="Arial" w:cs="Arial" w:eastAsia="Arial" w:hAnsi="Arial"/>
+        </w:rPr>
+        <w:t xml:space="preserve"> cạnh một kết quả tìm kiếm. Chưa gõ tên thì app mở ngay ô đặt tên.</w:t>
       </w:r>
     </w:p>
     <w:p>
@@ -5135,18 +5575,7 @@
         <w:rPr>
           <w:rFonts w:ascii="Arial" w:cs="Arial" w:eastAsia="Arial" w:hAnsi="Arial"/>
         </w:rPr>
-        <w:t xml:space="preserve">Các nơi đã lưu hiện thành nút nhanh trong hộp dẫn đường; bấm để đi ngay hoặc nói “đi đến nhà”.</w:t>
-      </w:r>
-    </w:p>
-    <w:p>
-      <w:pPr>
-        <w:pStyle w:val="Heading2"/>
-      </w:pPr>
-      <w:r>
-        <w:rPr>
-          <w:rFonts w:ascii="Arial" w:cs="Arial" w:eastAsia="Arial" w:hAnsi="Arial"/>
-        </w:rPr>
-        <w:t xml:space="preserve">6.4. Trong khi dẫn đường</w:t>
+        <w:t xml:space="preserve">Các nơi đã lưu hiện thành nút nhanh trong hộp dẫn đường; bấm để đi hoặc nói “đi đến nhà”.</w:t>
       </w:r>
     </w:p>
     <w:p>
@@ -5161,8 +5590,83 @@
       <w:r>
         <w:rPr>
           <w:rFonts w:ascii="Arial" w:cs="Arial" w:eastAsia="Arial" w:hAnsi="Arial"/>
-        </w:rPr>
-        <w:t xml:space="preserve">Thẻ hướng dẫn cho biết khoảng cách tới chỗ rẽ, tên đường, quãng đường và thời gian còn lại.</w:t>
+          <w:b/>
+          <w:bCs/>
+        </w:rPr>
+        <w:t xml:space="preserve">Đổi tên</w:t>
+      </w:r>
+      <w:r>
+        <w:rPr>
+          <w:rFonts w:ascii="Arial" w:cs="Arial" w:eastAsia="Arial" w:hAnsi="Arial"/>
+        </w:rPr>
+        <w:t xml:space="preserve">: bấm </w:t>
+      </w:r>
+      <w:r>
+        <w:rPr>
+          <w:rFonts w:ascii="Arial" w:cs="Arial" w:eastAsia="Arial" w:hAnsi="Arial"/>
+          <w:b/>
+          <w:bCs/>
+        </w:rPr>
+        <w:t xml:space="preserve">✎</w:t>
+      </w:r>
+      <w:r>
+        <w:rPr>
+          <w:rFonts w:ascii="Arial" w:cs="Arial" w:eastAsia="Arial" w:hAnsi="Arial"/>
+        </w:rPr>
+        <w:t xml:space="preserve"> cạnh điểm lưu → sửa → </w:t>
+      </w:r>
+      <w:r>
+        <w:rPr>
+          <w:rFonts w:ascii="Arial" w:cs="Arial" w:eastAsia="Arial" w:hAnsi="Arial"/>
+          <w:b/>
+          <w:bCs/>
+        </w:rPr>
+        <w:t xml:space="preserve">Lưu</w:t>
+      </w:r>
+      <w:r>
+        <w:rPr>
+          <w:rFonts w:ascii="Arial" w:cs="Arial" w:eastAsia="Arial" w:hAnsi="Arial"/>
+        </w:rPr>
+        <w:t xml:space="preserve">. </w:t>
+      </w:r>
+      <w:r>
+        <w:rPr>
+          <w:rFonts w:ascii="Arial" w:cs="Arial" w:eastAsia="Arial" w:hAnsi="Arial"/>
+          <w:b/>
+          <w:bCs/>
+        </w:rPr>
+        <w:t xml:space="preserve">Xoá</w:t>
+      </w:r>
+      <w:r>
+        <w:rPr>
+          <w:rFonts w:ascii="Arial" w:cs="Arial" w:eastAsia="Arial" w:hAnsi="Arial"/>
+        </w:rPr>
+        <w:t xml:space="preserve">: bấm </w:t>
+      </w:r>
+      <w:r>
+        <w:rPr>
+          <w:rFonts w:ascii="Arial" w:cs="Arial" w:eastAsia="Arial" w:hAnsi="Arial"/>
+          <w:b/>
+          <w:bCs/>
+        </w:rPr>
+        <w:t xml:space="preserve">×</w:t>
+      </w:r>
+      <w:r>
+        <w:rPr>
+          <w:rFonts w:ascii="Arial" w:cs="Arial" w:eastAsia="Arial" w:hAnsi="Arial"/>
+        </w:rPr>
+        <w:t xml:space="preserve"> (có Hoàn tác).</w:t>
+      </w:r>
+    </w:p>
+    <w:p>
+      <w:pPr>
+        <w:pStyle w:val="Heading2"/>
+      </w:pPr>
+      <w:r>
+        <w:rPr>
+          <w:rFonts w:ascii="Arial" w:cs="Arial" w:eastAsia="Arial" w:hAnsi="Arial"/>
+        </w:rPr>
+        <w:t xml:space="preserve">6.4. Trong khi dẫn đường</w:t>
       </w:r>
     </w:p>
     <w:p>
@@ -5178,21 +5682,7 @@
         <w:rPr>
           <w:rFonts w:ascii="Arial" w:cs="Arial" w:eastAsia="Arial" w:hAnsi="Arial"/>
         </w:rPr>
-        <w:t xml:space="preserve">Lộ trình được báo trước là </w:t>
-      </w:r>
-      <w:r>
-        <w:rPr>
-          <w:rFonts w:ascii="Arial" w:cs="Arial" w:eastAsia="Arial" w:hAnsi="Arial"/>
-          <w:b/>
-          <w:bCs/>
-        </w:rPr>
-        <w:t xml:space="preserve">có đi qua camera</w:t>
-      </w:r>
-      <w:r>
-        <w:rPr>
-          <w:rFonts w:ascii="Arial" w:cs="Arial" w:eastAsia="Arial" w:hAnsi="Arial"/>
-        </w:rPr>
-        <w:t xml:space="preserve"> hay không.</w:t>
+        <w:t xml:space="preserve">Thẻ hướng dẫn cho biết khoảng cách tới chỗ rẽ, tên đường, quãng đường và thời gian còn lại.</w:t>
       </w:r>
     </w:p>
     <w:p>
@@ -5208,7 +5698,67 @@
         <w:rPr>
           <w:rFonts w:ascii="Arial" w:cs="Arial" w:eastAsia="Arial" w:hAnsi="Arial"/>
         </w:rPr>
-        <w:t xml:space="preserve">Đi lệch đường: app tự tính lại lộ trình.</w:t>
+        <w:t xml:space="preserve">Lộ trình được báo trước là </w:t>
+      </w:r>
+      <w:r>
+        <w:rPr>
+          <w:rFonts w:ascii="Arial" w:cs="Arial" w:eastAsia="Arial" w:hAnsi="Arial"/>
+          <w:b/>
+          <w:bCs/>
+        </w:rPr>
+        <w:t xml:space="preserve">có đi qua camera</w:t>
+      </w:r>
+      <w:r>
+        <w:rPr>
+          <w:rFonts w:ascii="Arial" w:cs="Arial" w:eastAsia="Arial" w:hAnsi="Arial"/>
+        </w:rPr>
+        <w:t xml:space="preserve"> hay không.</w:t>
+      </w:r>
+    </w:p>
+    <w:p>
+      <w:pPr>
+        <w:pStyle w:val="ListParagraph"/>
+        <w:numPr>
+          <w:ilvl w:val="0"/>
+          <w:numId w:val="2"/>
+        </w:numPr>
+        <w:spacing w:after="60" w:line="290"/>
+      </w:pPr>
+      <w:r>
+        <w:rPr>
+          <w:rFonts w:ascii="Arial" w:cs="Arial" w:eastAsia="Arial" w:hAnsi="Arial"/>
+        </w:rPr>
+        <w:t xml:space="preserve">Đi lệch đường: app tự tính lại lộ trình (thử lại định kỳ nếu mất sóng).</w:t>
+      </w:r>
+    </w:p>
+    <w:p>
+      <w:pPr>
+        <w:pStyle w:val="ListParagraph"/>
+        <w:numPr>
+          <w:ilvl w:val="0"/>
+          <w:numId w:val="2"/>
+        </w:numPr>
+        <w:spacing w:after="60" w:line="290"/>
+      </w:pPr>
+      <w:r>
+        <w:rPr>
+          <w:rFonts w:ascii="Arial" w:cs="Arial" w:eastAsia="Arial" w:hAnsi="Arial"/>
+        </w:rPr>
+        <w:t xml:space="preserve">Muốn đổi tuyến giữa chừng: </w:t>
+      </w:r>
+      <w:r>
+        <w:rPr>
+          <w:rFonts w:ascii="Arial" w:cs="Arial" w:eastAsia="Arial" w:hAnsi="Arial"/>
+          <w:b/>
+          <w:bCs/>
+        </w:rPr>
+        <w:t xml:space="preserve">chạm dòng “… còn x km · khoảng y phút”</w:t>
+      </w:r>
+      <w:r>
+        <w:rPr>
+          <w:rFonts w:ascii="Arial" w:cs="Arial" w:eastAsia="Arial" w:hAnsi="Arial"/>
+        </w:rPr>
+        <w:t xml:space="preserve"> dưới thẻ dẫn đường → app tìm các lộ trình khác từ vị trí hiện tại để chọn.</w:t>
       </w:r>
     </w:p>
     <w:p>
@@ -8254,7 +8804,37 @@
         <w:rPr>
           <w:rFonts w:ascii="Arial" w:cs="Arial" w:eastAsia="Arial" w:hAnsi="Arial"/>
         </w:rPr>
-        <w:t xml:space="preserve">12.5. Giao diện</w:t>
+        <w:t xml:space="preserve">12.5. Góp ý &amp; đánh giá</w:t>
+      </w:r>
+    </w:p>
+    <w:p>
+      <w:pPr>
+        <w:spacing w:after="120" w:line="300"/>
+      </w:pPr>
+      <w:r>
+        <w:rPr>
+          <w:rFonts w:ascii="Arial" w:cs="Arial" w:eastAsia="Arial" w:hAnsi="Arial"/>
+          <w:b/>
+          <w:bCs/>
+        </w:rPr>
+        <w:t xml:space="preserve">Cài đặt → Góp ý &amp; đánh giá…</w:t>
+      </w:r>
+      <w:r>
+        <w:rPr>
+          <w:rFonts w:ascii="Arial" w:cs="Arial" w:eastAsia="Arial" w:hAnsi="Arial"/>
+        </w:rPr>
+        <w:t xml:space="preserve">: chấm 1–5 sao, chọn loại (Đề xuất tính năng, Lỗi app, Sai giới hạn tốc độ, Sai/thiếu camera, Khác) và viết nội dung. Tích “Gửi kèm vị trí” nếu góp ý về một chỗ cụ thể. Mất mạng thì góp ý được lưu và tự gửi sau.</w:t>
+      </w:r>
+    </w:p>
+    <w:p>
+      <w:pPr>
+        <w:pStyle w:val="Heading2"/>
+      </w:pPr>
+      <w:r>
+        <w:rPr>
+          <w:rFonts w:ascii="Arial" w:cs="Arial" w:eastAsia="Arial" w:hAnsi="Arial"/>
+        </w:rPr>
+        <w:t xml:space="preserve">12.6. Giao diện</w:t>
       </w:r>
     </w:p>
     <w:p>
@@ -8700,7 +9280,7 @@
                 <w:sz w:val="20"/>
                 <w:szCs w:val="20"/>
               </w:rPr>
-              <w:t xml:space="preserve">Báo cảnh báo trước</w:t>
+              <w:t xml:space="preserve">Số tốc độ hiển thị</w:t>
             </w:r>
           </w:p>
         </w:tc>
@@ -8727,7 +9307,7 @@
                 <w:sz w:val="20"/>
                 <w:szCs w:val="20"/>
               </w:rPr>
-              <w:t xml:space="preserve">300 / 500 / 800 / 1000 m</w:t>
+              <w:t xml:space="preserve">Theo GPS / Như đồng hồ xe +3…10%</w:t>
             </w:r>
           </w:p>
         </w:tc>
@@ -8754,7 +9334,7 @@
                 <w:sz w:val="20"/>
                 <w:szCs w:val="20"/>
               </w:rPr>
-              <w:t xml:space="preserve">Mặc định 500 m</w:t>
+              <w:t xml:space="preserve">Mục 4.2</w:t>
             </w:r>
           </w:p>
         </w:tc>
@@ -8786,7 +9366,7 @@
                 <w:sz w:val="20"/>
                 <w:szCs w:val="20"/>
               </w:rPr>
-              <w:t xml:space="preserve">Giao diện</w:t>
+              <w:t xml:space="preserve">Báo cảnh báo trước</w:t>
             </w:r>
           </w:p>
         </w:tc>
@@ -8813,7 +9393,7 @@
                 <w:sz w:val="20"/>
                 <w:szCs w:val="20"/>
               </w:rPr>
-              <w:t xml:space="preserve">Theo thiết bị / Tối / Sáng</w:t>
+              <w:t xml:space="preserve">300 / 500 / 800 / 1000 m</w:t>
             </w:r>
           </w:p>
         </w:tc>
@@ -8833,7 +9413,16 @@
               <w:right w:type="dxa" w:w="100"/>
             </w:tcMar>
           </w:tcPr>
-          <w:p/>
+          <w:p>
+            <w:r>
+              <w:rPr>
+                <w:rFonts w:ascii="Arial" w:cs="Arial" w:eastAsia="Arial" w:hAnsi="Arial"/>
+                <w:sz w:val="20"/>
+                <w:szCs w:val="20"/>
+              </w:rPr>
+              <w:t xml:space="preserve">Mặc định 500 m</w:t>
+            </w:r>
+          </w:p>
         </w:tc>
       </w:tr>
       <w:tr>
@@ -8863,7 +9452,7 @@
                 <w:sz w:val="20"/>
                 <w:szCs w:val="20"/>
               </w:rPr>
-              <w:t xml:space="preserve">Đọc cảnh báo bằng giọng nói</w:t>
+              <w:t xml:space="preserve">Giao diện</w:t>
             </w:r>
           </w:p>
         </w:tc>
@@ -8890,7 +9479,7 @@
                 <w:sz w:val="20"/>
                 <w:szCs w:val="20"/>
               </w:rPr>
-              <w:t xml:space="preserve">Bật / Tắt</w:t>
+              <w:t xml:space="preserve">Theo thiết bị / Tối / Sáng</w:t>
             </w:r>
           </w:p>
         </w:tc>
@@ -8910,16 +9499,7 @@
               <w:right w:type="dxa" w:w="100"/>
             </w:tcMar>
           </w:tcPr>
-          <w:p>
-            <w:r>
-              <w:rPr>
-                <w:rFonts w:ascii="Arial" w:cs="Arial" w:eastAsia="Arial" w:hAnsi="Arial"/>
-                <w:sz w:val="20"/>
-                <w:szCs w:val="20"/>
-              </w:rPr>
-              <w:t xml:space="preserve">Cũng bật/tắt được bằng nút 🔊</w:t>
-            </w:r>
-          </w:p>
+          <w:p/>
         </w:tc>
       </w:tr>
       <w:tr>
@@ -8949,7 +9529,7 @@
                 <w:sz w:val="20"/>
                 <w:szCs w:val="20"/>
               </w:rPr>
-              <w:t xml:space="preserve">Giọng đọc, Kiểu giọng</w:t>
+              <w:t xml:space="preserve">Đọc cảnh báo bằng giọng nói</w:t>
             </w:r>
           </w:p>
         </w:tc>
@@ -8976,7 +9556,7 @@
                 <w:sz w:val="20"/>
                 <w:szCs w:val="20"/>
               </w:rPr>
-              <w:t xml:space="preserve">Theo giọng có trên máy; Dễ thương / Bình thường / Trầm ấm</w:t>
+              <w:t xml:space="preserve">Bật / Tắt</w:t>
             </w:r>
           </w:p>
         </w:tc>
@@ -8996,7 +9576,16 @@
               <w:right w:type="dxa" w:w="100"/>
             </w:tcMar>
           </w:tcPr>
-          <w:p/>
+          <w:p>
+            <w:r>
+              <w:rPr>
+                <w:rFonts w:ascii="Arial" w:cs="Arial" w:eastAsia="Arial" w:hAnsi="Arial"/>
+                <w:sz w:val="20"/>
+                <w:szCs w:val="20"/>
+              </w:rPr>
+              <w:t xml:space="preserve">Cũng bật/tắt được bằng nút 🔊</w:t>
+            </w:r>
+          </w:p>
         </w:tc>
       </w:tr>
       <w:tr>
@@ -9026,7 +9615,7 @@
                 <w:sz w:val="20"/>
                 <w:szCs w:val="20"/>
               </w:rPr>
-              <w:t xml:space="preserve">Bản đồ offline theo tỉnh</w:t>
+              <w:t xml:space="preserve">Giọng đọc, Kiểu giọng</w:t>
             </w:r>
           </w:p>
         </w:tc>
@@ -9053,7 +9642,7 @@
                 <w:sz w:val="20"/>
                 <w:szCs w:val="20"/>
               </w:rPr>
-              <w:t xml:space="preserve">Tải / Cập nhật / Xoá</w:t>
+              <w:t xml:space="preserve">Theo giọng có trên máy; Dễ thương / Bình thường / Trầm ấm</w:t>
             </w:r>
           </w:p>
         </w:tc>
@@ -9073,16 +9662,7 @@
               <w:right w:type="dxa" w:w="100"/>
             </w:tcMar>
           </w:tcPr>
-          <w:p>
-            <w:r>
-              <w:rPr>
-                <w:rFonts w:ascii="Arial" w:cs="Arial" w:eastAsia="Arial" w:hAnsi="Arial"/>
-                <w:sz w:val="20"/>
-                <w:szCs w:val="20"/>
-              </w:rPr>
-              <w:t xml:space="preserve">Mục 7</w:t>
-            </w:r>
-          </w:p>
+          <w:p/>
         </w:tc>
       </w:tr>
       <w:tr>
@@ -9112,7 +9692,7 @@
                 <w:sz w:val="20"/>
                 <w:szCs w:val="20"/>
               </w:rPr>
-              <w:t xml:space="preserve">Nhắc nghỉ</w:t>
+              <w:t xml:space="preserve">Bản đồ offline theo tỉnh</w:t>
             </w:r>
           </w:p>
         </w:tc>
@@ -9139,7 +9719,7 @@
                 <w:sz w:val="20"/>
                 <w:szCs w:val="20"/>
               </w:rPr>
-              <w:t xml:space="preserve">Tắt / 2 / 3 / 4 giờ</w:t>
+              <w:t xml:space="preserve">Tải / Cập nhật / Xoá</w:t>
             </w:r>
           </w:p>
         </w:tc>
@@ -9166,7 +9746,7 @@
                 <w:sz w:val="20"/>
                 <w:szCs w:val="20"/>
               </w:rPr>
-              <w:t xml:space="preserve">Mục 11.2</w:t>
+              <w:t xml:space="preserve">Mục 7</w:t>
             </w:r>
           </w:p>
         </w:tc>
@@ -9198,7 +9778,7 @@
                 <w:sz w:val="20"/>
                 <w:szCs w:val="20"/>
               </w:rPr>
-              <w:t xml:space="preserve">Chiếu kính lái (HUD)</w:t>
+              <w:t xml:space="preserve">Nhắc nghỉ</w:t>
             </w:r>
           </w:p>
         </w:tc>
@@ -9225,7 +9805,7 @@
                 <w:sz w:val="20"/>
                 <w:szCs w:val="20"/>
               </w:rPr>
-              <w:t xml:space="preserve">Không lật / Lật ngang / Lật dọc</w:t>
+              <w:t xml:space="preserve">Tắt / 2 / 3 / 4 giờ</w:t>
             </w:r>
           </w:p>
         </w:tc>
@@ -9252,7 +9832,7 @@
                 <w:sz w:val="20"/>
                 <w:szCs w:val="20"/>
               </w:rPr>
-              <w:t xml:space="preserve">Mục 12.2</w:t>
+              <w:t xml:space="preserve">Mục 11.2</w:t>
             </w:r>
           </w:p>
         </w:tc>
@@ -9284,7 +9864,7 @@
                 <w:sz w:val="20"/>
                 <w:szCs w:val="20"/>
               </w:rPr>
-              <w:t xml:space="preserve">Chuyến đi, Video, Báo cáo, Đội xe, Tuần tra, OBD</w:t>
+              <w:t xml:space="preserve">Chiếu kính lái (HUD)</w:t>
             </w:r>
           </w:p>
         </w:tc>
@@ -9311,7 +9891,7 @@
                 <w:sz w:val="20"/>
                 <w:szCs w:val="20"/>
               </w:rPr>
-              <w:t xml:space="preserve">Các hộp quản lý riêng</w:t>
+              <w:t xml:space="preserve">Không lật / Lật ngang / Lật dọc</w:t>
             </w:r>
           </w:p>
         </w:tc>
@@ -9338,7 +9918,7 @@
                 <w:sz w:val="20"/>
                 <w:szCs w:val="20"/>
               </w:rPr>
-              <w:t xml:space="preserve">Mục 9, 10, 12</w:t>
+              <w:t xml:space="preserve">Mục 12.2</w:t>
             </w:r>
           </w:p>
         </w:tc>
@@ -9370,7 +9950,7 @@
                 <w:sz w:val="20"/>
                 <w:szCs w:val="20"/>
               </w:rPr>
-              <w:t xml:space="preserve">SOS va chạm</w:t>
+              <w:t xml:space="preserve">Chuyến đi, Video, Báo cáo, Đội xe, Tuần tra, OBD</w:t>
             </w:r>
           </w:p>
         </w:tc>
@@ -9397,7 +9977,7 @@
                 <w:sz w:val="20"/>
                 <w:szCs w:val="20"/>
               </w:rPr>
-              <w:t xml:space="preserve">Số điện thoại, Bật/Tắt, Thử</w:t>
+              <w:t xml:space="preserve">Các hộp quản lý riêng</w:t>
             </w:r>
           </w:p>
         </w:tc>
@@ -9424,7 +10004,7 @@
                 <w:sz w:val="20"/>
                 <w:szCs w:val="20"/>
               </w:rPr>
-              <w:t xml:space="preserve">Mục 11.1</w:t>
+              <w:t xml:space="preserve">Mục 9, 10, 12</w:t>
             </w:r>
           </w:p>
         </w:tc>
@@ -9456,7 +10036,7 @@
                 <w:sz w:val="20"/>
                 <w:szCs w:val="20"/>
               </w:rPr>
-              <w:t xml:space="preserve">Thử nghiệm</w:t>
+              <w:t xml:space="preserve">SOS va chạm</w:t>
             </w:r>
           </w:p>
         </w:tc>
@@ -9483,7 +10063,7 @@
                 <w:sz w:val="20"/>
                 <w:szCs w:val="20"/>
               </w:rPr>
-              <w:t xml:space="preserve">Đọc biển tốc độ bằng camera</w:t>
+              <w:t xml:space="preserve">Số điện thoại, Bật/Tắt, Thử</w:t>
             </w:r>
           </w:p>
         </w:tc>
@@ -9510,7 +10090,7 @@
                 <w:sz w:val="20"/>
                 <w:szCs w:val="20"/>
               </w:rPr>
-              <w:t xml:space="preserve">Mục 4.2</w:t>
+              <w:t xml:space="preserve">Mục 11.1</w:t>
             </w:r>
           </w:p>
         </w:tc>
@@ -9542,6 +10122,92 @@
                 <w:sz w:val="20"/>
                 <w:szCs w:val="20"/>
               </w:rPr>
+              <w:t xml:space="preserve">Thử nghiệm</w:t>
+            </w:r>
+          </w:p>
+        </w:tc>
+        <w:tc>
+          <w:tcPr>
+            <w:tcW w:type="dxa" w:w="3800"/>
+            <w:tcBorders>
+              <w:top w:val="single" w:color="BFBFBF" w:sz="4"/>
+              <w:left w:val="single" w:color="BFBFBF" w:sz="4"/>
+              <w:bottom w:val="single" w:color="BFBFBF" w:sz="4"/>
+              <w:right w:val="single" w:color="BFBFBF" w:sz="4"/>
+            </w:tcBorders>
+            <w:tcMar>
+              <w:top w:type="dxa" w:w="60"/>
+              <w:left w:type="dxa" w:w="100"/>
+              <w:bottom w:type="dxa" w:w="60"/>
+              <w:right w:type="dxa" w:w="100"/>
+            </w:tcMar>
+          </w:tcPr>
+          <w:p>
+            <w:r>
+              <w:rPr>
+                <w:rFonts w:ascii="Arial" w:cs="Arial" w:eastAsia="Arial" w:hAnsi="Arial"/>
+                <w:sz w:val="20"/>
+                <w:szCs w:val="20"/>
+              </w:rPr>
+              <w:t xml:space="preserve">Đọc biển tốc độ bằng camera</w:t>
+            </w:r>
+          </w:p>
+        </w:tc>
+        <w:tc>
+          <w:tcPr>
+            <w:tcW w:type="dxa" w:w="2838"/>
+            <w:tcBorders>
+              <w:top w:val="single" w:color="BFBFBF" w:sz="4"/>
+              <w:left w:val="single" w:color="BFBFBF" w:sz="4"/>
+              <w:bottom w:val="single" w:color="BFBFBF" w:sz="4"/>
+              <w:right w:val="single" w:color="BFBFBF" w:sz="4"/>
+            </w:tcBorders>
+            <w:tcMar>
+              <w:top w:type="dxa" w:w="60"/>
+              <w:left w:type="dxa" w:w="100"/>
+              <w:bottom w:type="dxa" w:w="60"/>
+              <w:right w:type="dxa" w:w="100"/>
+            </w:tcMar>
+          </w:tcPr>
+          <w:p>
+            <w:r>
+              <w:rPr>
+                <w:rFonts w:ascii="Arial" w:cs="Arial" w:eastAsia="Arial" w:hAnsi="Arial"/>
+                <w:sz w:val="20"/>
+                <w:szCs w:val="20"/>
+              </w:rPr>
+              <w:t xml:space="preserve">Mục 4.2</w:t>
+            </w:r>
+          </w:p>
+        </w:tc>
+      </w:tr>
+      <w:tr>
+        <w:trPr>
+          <w:tblHeader w:val="off"/>
+        </w:trPr>
+        <w:tc>
+          <w:tcPr>
+            <w:tcW w:type="dxa" w:w="3000"/>
+            <w:tcBorders>
+              <w:top w:val="single" w:color="BFBFBF" w:sz="4"/>
+              <w:left w:val="single" w:color="BFBFBF" w:sz="4"/>
+              <w:bottom w:val="single" w:color="BFBFBF" w:sz="4"/>
+              <w:right w:val="single" w:color="BFBFBF" w:sz="4"/>
+            </w:tcBorders>
+            <w:tcMar>
+              <w:top w:type="dxa" w:w="60"/>
+              <w:left w:type="dxa" w:w="100"/>
+              <w:bottom w:type="dxa" w:w="60"/>
+              <w:right w:type="dxa" w:w="100"/>
+            </w:tcMar>
+          </w:tcPr>
+          <w:p>
+            <w:r>
+              <w:rPr>
+                <w:rFonts w:ascii="Arial" w:cs="Arial" w:eastAsia="Arial" w:hAnsi="Arial"/>
+                <w:sz w:val="20"/>
+                <w:szCs w:val="20"/>
+              </w:rPr>
               <w:t xml:space="preserve">Camera tự đánh dấu</w:t>
             </w:r>
           </w:p>
@@ -9569,7 +10235,7 @@
                 <w:sz w:val="20"/>
                 <w:szCs w:val="20"/>
               </w:rPr>
-              <w:t xml:space="preserve">Đồng bộ ngay / Xoá dấu trên máy</w:t>
+              <w:t xml:space="preserve">Danh sách dấu (Xoá từng dấu) / Đồng bộ ngay / Xoá tất cả</w:t>
             </w:r>
           </w:p>
         </w:tc>
@@ -9596,7 +10262,93 @@
                 <w:sz w:val="20"/>
                 <w:szCs w:val="20"/>
               </w:rPr>
-              <w:t xml:space="preserve">Mục 5.3</w:t>
+              <w:t xml:space="preserve">Mục 5.3–5.4</w:t>
+            </w:r>
+          </w:p>
+        </w:tc>
+      </w:tr>
+      <w:tr>
+        <w:trPr>
+          <w:tblHeader w:val="off"/>
+        </w:trPr>
+        <w:tc>
+          <w:tcPr>
+            <w:tcW w:type="dxa" w:w="3000"/>
+            <w:tcBorders>
+              <w:top w:val="single" w:color="BFBFBF" w:sz="4"/>
+              <w:left w:val="single" w:color="BFBFBF" w:sz="4"/>
+              <w:bottom w:val="single" w:color="BFBFBF" w:sz="4"/>
+              <w:right w:val="single" w:color="BFBFBF" w:sz="4"/>
+            </w:tcBorders>
+            <w:tcMar>
+              <w:top w:type="dxa" w:w="60"/>
+              <w:left w:type="dxa" w:w="100"/>
+              <w:bottom w:type="dxa" w:w="60"/>
+              <w:right w:type="dxa" w:w="100"/>
+            </w:tcMar>
+          </w:tcPr>
+          <w:p>
+            <w:r>
+              <w:rPr>
+                <w:rFonts w:ascii="Arial" w:cs="Arial" w:eastAsia="Arial" w:hAnsi="Arial"/>
+                <w:sz w:val="20"/>
+                <w:szCs w:val="20"/>
+              </w:rPr>
+              <w:t xml:space="preserve">Góp ý &amp; đánh giá</w:t>
+            </w:r>
+          </w:p>
+        </w:tc>
+        <w:tc>
+          <w:tcPr>
+            <w:tcW w:type="dxa" w:w="3800"/>
+            <w:tcBorders>
+              <w:top w:val="single" w:color="BFBFBF" w:sz="4"/>
+              <w:left w:val="single" w:color="BFBFBF" w:sz="4"/>
+              <w:bottom w:val="single" w:color="BFBFBF" w:sz="4"/>
+              <w:right w:val="single" w:color="BFBFBF" w:sz="4"/>
+            </w:tcBorders>
+            <w:tcMar>
+              <w:top w:type="dxa" w:w="60"/>
+              <w:left w:type="dxa" w:w="100"/>
+              <w:bottom w:type="dxa" w:w="60"/>
+              <w:right w:type="dxa" w:w="100"/>
+            </w:tcMar>
+          </w:tcPr>
+          <w:p>
+            <w:r>
+              <w:rPr>
+                <w:rFonts w:ascii="Arial" w:cs="Arial" w:eastAsia="Arial" w:hAnsi="Arial"/>
+                <w:sz w:val="20"/>
+                <w:szCs w:val="20"/>
+              </w:rPr>
+              <w:t xml:space="preserve">Sao, loại, nội dung, kèm vị trí</w:t>
+            </w:r>
+          </w:p>
+        </w:tc>
+        <w:tc>
+          <w:tcPr>
+            <w:tcW w:type="dxa" w:w="2838"/>
+            <w:tcBorders>
+              <w:top w:val="single" w:color="BFBFBF" w:sz="4"/>
+              <w:left w:val="single" w:color="BFBFBF" w:sz="4"/>
+              <w:bottom w:val="single" w:color="BFBFBF" w:sz="4"/>
+              <w:right w:val="single" w:color="BFBFBF" w:sz="4"/>
+            </w:tcBorders>
+            <w:tcMar>
+              <w:top w:type="dxa" w:w="60"/>
+              <w:left w:type="dxa" w:w="100"/>
+              <w:bottom w:type="dxa" w:w="60"/>
+              <w:right w:type="dxa" w:w="100"/>
+            </w:tcMar>
+          </w:tcPr>
+          <w:p>
+            <w:r>
+              <w:rPr>
+                <w:rFonts w:ascii="Arial" w:cs="Arial" w:eastAsia="Arial" w:hAnsi="Arial"/>
+                <w:sz w:val="20"/>
+                <w:szCs w:val="20"/>
+              </w:rPr>
+              <w:t xml:space="preserve">Mục 12.5</w:t>
             </w:r>
           </w:p>
         </w:tc>
@@ -10237,6 +10989,142 @@
                 <w:szCs w:val="20"/>
               </w:rPr>
               <w:t xml:space="preserve">Cho phép quyền Micro; nói rõ, gần điện thoại; trên iPhone dùng Safari phiên bản mới.</w:t>
+            </w:r>
+          </w:p>
+        </w:tc>
+      </w:tr>
+      <w:tr>
+        <w:trPr>
+          <w:tblHeader w:val="off"/>
+        </w:trPr>
+        <w:tc>
+          <w:tcPr>
+            <w:tcW w:type="dxa" w:w="3000"/>
+            <w:tcBorders>
+              <w:top w:val="single" w:color="BFBFBF" w:sz="4"/>
+              <w:left w:val="single" w:color="BFBFBF" w:sz="4"/>
+              <w:bottom w:val="single" w:color="BFBFBF" w:sz="4"/>
+              <w:right w:val="single" w:color="BFBFBF" w:sz="4"/>
+            </w:tcBorders>
+            <w:tcMar>
+              <w:top w:type="dxa" w:w="60"/>
+              <w:left w:type="dxa" w:w="100"/>
+              <w:bottom w:type="dxa" w:w="60"/>
+              <w:right w:type="dxa" w:w="100"/>
+            </w:tcMar>
+          </w:tcPr>
+          <w:p>
+            <w:r>
+              <w:rPr>
+                <w:rFonts w:ascii="Arial" w:cs="Arial" w:eastAsia="Arial" w:hAnsi="Arial"/>
+                <w:sz w:val="20"/>
+                <w:szCs w:val="20"/>
+              </w:rPr>
+              <w:t xml:space="preserve">Số tốc độ thấp hơn đồng hồ xe</w:t>
+            </w:r>
+          </w:p>
+        </w:tc>
+        <w:tc>
+          <w:tcPr>
+            <w:tcW w:type="dxa" w:w="6638"/>
+            <w:tcBorders>
+              <w:top w:val="single" w:color="BFBFBF" w:sz="4"/>
+              <w:left w:val="single" w:color="BFBFBF" w:sz="4"/>
+              <w:bottom w:val="single" w:color="BFBFBF" w:sz="4"/>
+              <w:right w:val="single" w:color="BFBFBF" w:sz="4"/>
+            </w:tcBorders>
+            <w:tcMar>
+              <w:top w:type="dxa" w:w="60"/>
+              <w:left w:type="dxa" w:w="100"/>
+              <w:bottom w:type="dxa" w:w="60"/>
+              <w:right w:type="dxa" w:w="100"/>
+            </w:tcMar>
+          </w:tcPr>
+          <w:p>
+            <w:r>
+              <w:rPr>
+                <w:rFonts w:ascii="Arial" w:cs="Arial" w:eastAsia="Arial" w:hAnsi="Arial"/>
+                <w:sz w:val="20"/>
+                <w:szCs w:val="20"/>
+              </w:rPr>
+              <w:t xml:space="preserve">Bình thường (đồng hồ xe báo cao hơn thật). Chỉnh </w:t>
+            </w:r>
+            <w:r>
+              <w:rPr>
+                <w:rFonts w:ascii="Arial" w:cs="Arial" w:eastAsia="Arial" w:hAnsi="Arial"/>
+                <w:b/>
+                <w:bCs/>
+                <w:sz w:val="20"/>
+                <w:szCs w:val="20"/>
+              </w:rPr>
+              <w:t xml:space="preserve">Số tốc độ hiển thị</w:t>
+            </w:r>
+            <w:r>
+              <w:rPr>
+                <w:rFonts w:ascii="Arial" w:cs="Arial" w:eastAsia="Arial" w:hAnsi="Arial"/>
+                <w:sz w:val="20"/>
+                <w:szCs w:val="20"/>
+              </w:rPr>
+              <w:t xml:space="preserve"> nếu muốn khớp (mục 4.2).</w:t>
+            </w:r>
+          </w:p>
+        </w:tc>
+      </w:tr>
+      <w:tr>
+        <w:trPr>
+          <w:tblHeader w:val="off"/>
+        </w:trPr>
+        <w:tc>
+          <w:tcPr>
+            <w:tcW w:type="dxa" w:w="3000"/>
+            <w:tcBorders>
+              <w:top w:val="single" w:color="BFBFBF" w:sz="4"/>
+              <w:left w:val="single" w:color="BFBFBF" w:sz="4"/>
+              <w:bottom w:val="single" w:color="BFBFBF" w:sz="4"/>
+              <w:right w:val="single" w:color="BFBFBF" w:sz="4"/>
+            </w:tcBorders>
+            <w:tcMar>
+              <w:top w:type="dxa" w:w="60"/>
+              <w:left w:type="dxa" w:w="100"/>
+              <w:bottom w:type="dxa" w:w="60"/>
+              <w:right w:type="dxa" w:w="100"/>
+            </w:tcMar>
+          </w:tcPr>
+          <w:p>
+            <w:r>
+              <w:rPr>
+                <w:rFonts w:ascii="Arial" w:cs="Arial" w:eastAsia="Arial" w:hAnsi="Arial"/>
+                <w:sz w:val="20"/>
+                <w:szCs w:val="20"/>
+              </w:rPr>
+              <w:t xml:space="preserve">Biển giới hạn nhảy qua lại</w:t>
+            </w:r>
+          </w:p>
+        </w:tc>
+        <w:tc>
+          <w:tcPr>
+            <w:tcW w:type="dxa" w:w="6638"/>
+            <w:tcBorders>
+              <w:top w:val="single" w:color="BFBFBF" w:sz="4"/>
+              <w:left w:val="single" w:color="BFBFBF" w:sz="4"/>
+              <w:bottom w:val="single" w:color="BFBFBF" w:sz="4"/>
+              <w:right w:val="single" w:color="BFBFBF" w:sz="4"/>
+            </w:tcBorders>
+            <w:tcMar>
+              <w:top w:type="dxa" w:w="60"/>
+              <w:left w:type="dxa" w:w="100"/>
+              <w:bottom w:type="dxa" w:w="60"/>
+              <w:right w:type="dxa" w:w="100"/>
+            </w:tcMar>
+          </w:tcPr>
+          <w:p>
+            <w:r>
+              <w:rPr>
+                <w:rFonts w:ascii="Arial" w:cs="Arial" w:eastAsia="Arial" w:hAnsi="Arial"/>
+                <w:sz w:val="20"/>
+                <w:szCs w:val="20"/>
+              </w:rPr>
+              <w:t xml:space="preserve">Đã xử lý: app giữ con đường đang đi. Nếu còn gặp, chạm biển → gửi góp ý kèm vị trí.</w:t>
             </w:r>
           </w:p>
         </w:tc>

</xml_diff>

<commit_message>
Hướng dẫn: ô tra cứu (lọc mục, tô vàng chỗ khớp, không phân biệt dấu), nút tra cứu nhanh, mục lục mở sẵn; bỏ nút tải Word
Co-Authored-By: Claude Opus 5.5 <noreply@anthropic.com>
Claude-Session: https://claude.ai/code/session_014bYGfLE9esUGsdvgTU55Kr
</commit_message>
<xml_diff>
--- a/docs/Huong-dan-su-dung-Lai-An-Toan.docx
+++ b/docs/Huong-dan-su-dung-Lai-An-Toan.docx
@@ -125,7 +125,7 @@
         </w:rPr>
         <w:t xml:space="preserve">Địa chỉ: </w:t>
       </w:r>
-      <w:hyperlink w:history="1" r:id="rIdlbxv-jzxmur7qksviarqm">
+      <w:hyperlink w:history="1" r:id="rIdg8luzwsgy14xd83wa9sjc">
         <w:r>
           <w:rPr>
             <w:rFonts w:ascii="Arial" w:cs="Arial" w:eastAsia="Arial" w:hAnsi="Arial"/>
@@ -5343,7 +5343,7 @@
         <w:rPr>
           <w:rFonts w:ascii="Arial" w:cs="Arial" w:eastAsia="Arial" w:hAnsi="Arial"/>
         </w:rPr>
-        <w:t xml:space="preserve">Gõ/dán toạ độ vào ô tìm: `10.7725, 106.698`, `11,06176 106,529633`, `(11.06176, 106.529633)` hoặc dạng độ-phút-giây `11°03'42.3"N 106°31'46.7"E`.</w:t>
+        <w:t xml:space="preserve">Gõ/dán toạ độ vào ô tìm: “10.7725, 106.698”, “11,06176 106,529633”, “(11.06176, 106.529633)” hoặc dạng độ-phút-giây “11°03'42.3"N 106°31'46.7"E”.</w:t>
       </w:r>
     </w:p>
     <w:p>
@@ -5359,7 +5359,7 @@
         <w:rPr>
           <w:rFonts w:ascii="Arial" w:cs="Arial" w:eastAsia="Arial" w:hAnsi="Arial"/>
         </w:rPr>
-        <w:t xml:space="preserve">Dán link chia sẻ từ Google Maps (kể cả link rút gọn `maps.app.goo.gl/…`), link OpenStreetMap. Kết quả hiện “Toạ độ …, cách … km” → bấm để đi.</w:t>
+        <w:t xml:space="preserve">Dán link chia sẻ từ Google Maps (kể cả link rút gọn “maps.app.goo.gl/…”), link OpenStreetMap. Kết quả hiện “Toạ độ …, cách … km” → bấm để đi.</w:t>
       </w:r>
     </w:p>
     <w:p>

</xml_diff>